<commit_message>
docs: atividade 4: Docker + N8N
</commit_message>
<xml_diff>
--- a/atv04/04-Leonardo_Cortes_Filho.docx
+++ b/atv04/04-Leonardo_Cortes_Filho.docx
@@ -86,19 +86,145 @@
           <w:sz w:val="20"/>
           <w:szCs w:val="20"/>
         </w:rPr>
-        <w:t xml:space="preserve">&lt;Nesta seção o participante deverá descrever com suas próprias palavras os temas abordados nas tarefas do card. É importante demonstrar que houve entendimento dos temas, isto mediante evidências com imagens, gráficos e textos originais produzidos por você. Códigos também podem ser referenciados desde que estejam no github ou Notebook entregue junto com o relatório&gt; </w:t>
-      </w:r>
-    </w:p>
-    <w:p>
-      <w:pPr>
-        <w:pStyle w:val="Normal"/>
-        <w:rPr>
-          <w:rFonts w:ascii="Arial" w:hAnsi="Arial" w:cs="Arial"/>
-        </w:rPr>
-      </w:pPr>
-      <w:r>
-        <w:rPr>
-          <w:rFonts w:cs="Arial" w:ascii="Arial" w:hAnsi="Arial"/>
+        <w:t>Docker é referência para compatibilidade de sistemas, para quem trabalha apenas com python seria a versão evoluida dos ambientes virtuais, de modo que, além de ignorar sistema operacional, permite que serviços (n8n, compiladores, etc) sejam criados e usados em versões específicas. O vídeo apresentou uma coisa nova para mim, que foi o uso de docker-compose com network para fazer comunicação direta entre as imagens.</w:t>
+      </w:r>
+    </w:p>
+    <w:p>
+      <w:pPr>
+        <w:pStyle w:val="Normal"/>
+        <w:rPr>
+          <w:rFonts w:ascii="Arial" w:hAnsi="Arial" w:cs="Arial"/>
+          <w:sz w:val="20"/>
+          <w:szCs w:val="20"/>
+        </w:rPr>
+      </w:pPr>
+      <w:r>
+        <w:rPr>
+          <w:rFonts w:cs="Arial" w:ascii="Arial" w:hAnsi="Arial"/>
+          <w:sz w:val="20"/>
+          <w:szCs w:val="20"/>
+        </w:rPr>
+        <w:t>Funcionamento Docker:</w:t>
+      </w:r>
+    </w:p>
+    <w:p>
+      <w:pPr>
+        <w:pStyle w:val="Normal"/>
+        <w:rPr>
+          <w:rFonts w:ascii="Arial" w:hAnsi="Arial" w:cs="Arial"/>
+          <w:sz w:val="20"/>
+          <w:szCs w:val="20"/>
+        </w:rPr>
+      </w:pPr>
+      <w:r>
+        <w:rPr>
+          <w:rFonts w:cs="Arial" w:ascii="Arial" w:hAnsi="Arial"/>
+          <w:sz w:val="20"/>
+          <w:szCs w:val="20"/>
+        </w:rPr>
+        <w:drawing>
+          <wp:anchor behindDoc="0" distT="0" distB="0" distL="0" distR="0" simplePos="0" locked="0" layoutInCell="0" allowOverlap="1" relativeHeight="2">
+            <wp:simplePos x="0" y="0"/>
+            <wp:positionH relativeFrom="column">
+              <wp:align>center</wp:align>
+            </wp:positionH>
+            <wp:positionV relativeFrom="paragraph">
+              <wp:posOffset>635</wp:posOffset>
+            </wp:positionV>
+            <wp:extent cx="5400040" cy="2306320"/>
+            <wp:effectExtent l="0" t="0" r="0" b="0"/>
+            <wp:wrapTopAndBottom/>
+            <wp:docPr id="1" name="Image1" descr=""/>
+            <wp:cNvGraphicFramePr>
+              <a:graphicFrameLocks xmlns:a="http://schemas.openxmlformats.org/drawingml/2006/main" noChangeAspect="1"/>
+            </wp:cNvGraphicFramePr>
+            <a:graphic xmlns:a="http://schemas.openxmlformats.org/drawingml/2006/main">
+              <a:graphicData uri="http://schemas.openxmlformats.org/drawingml/2006/picture">
+                <pic:pic xmlns:pic="http://schemas.openxmlformats.org/drawingml/2006/picture">
+                  <pic:nvPicPr>
+                    <pic:cNvPr id="1" name="Image1" descr=""/>
+                    <pic:cNvPicPr>
+                      <a:picLocks noChangeAspect="1" noChangeArrowheads="1"/>
+                    </pic:cNvPicPr>
+                  </pic:nvPicPr>
+                  <pic:blipFill>
+                    <a:blip r:embed="rId2"/>
+                    <a:stretch>
+                      <a:fillRect/>
+                    </a:stretch>
+                  </pic:blipFill>
+                  <pic:spPr bwMode="auto">
+                    <a:xfrm>
+                      <a:off x="0" y="0"/>
+                      <a:ext cx="5400040" cy="2306320"/>
+                    </a:xfrm>
+                    <a:prstGeom prst="rect">
+                      <a:avLst/>
+                    </a:prstGeom>
+                  </pic:spPr>
+                </pic:pic>
+              </a:graphicData>
+            </a:graphic>
+          </wp:anchor>
+        </w:drawing>
+      </w:r>
+    </w:p>
+    <w:p>
+      <w:pPr>
+        <w:pStyle w:val="Normal"/>
+        <w:rPr>
+          <w:rFonts w:ascii="Arial" w:hAnsi="Arial" w:cs="Arial"/>
+          <w:sz w:val="20"/>
+          <w:szCs w:val="20"/>
+        </w:rPr>
+      </w:pPr>
+      <w:r>
+        <w:rPr>
+          <w:rFonts w:cs="Arial" w:ascii="Arial" w:hAnsi="Arial"/>
+          <w:sz w:val="20"/>
+          <w:szCs w:val="20"/>
+        </w:rPr>
+        <w:t>N8N é uma ferramenta de automação low-code, onde diversos módulos são oferidos para o usuário, permitindo integração fácil entre diversas ferramentas. Uma aplicação que eu já criei anteriormente, foi usar Groq para resumir todos os e-mails da semana, sendo uma aplicação simples, mas que foi incrivelmente fácil de implementar.</w:t>
+      </w:r>
+    </w:p>
+    <w:p>
+      <w:pPr>
+        <w:pStyle w:val="Normal"/>
+        <w:rPr>
+          <w:rFonts w:ascii="Arial" w:hAnsi="Arial" w:cs="Arial"/>
+          <w:position w:val="0"/>
+          <w:sz w:val="20"/>
+          <w:sz w:val="20"/>
+          <w:szCs w:val="20"/>
+          <w:vertAlign w:val="baseline"/>
+        </w:rPr>
+      </w:pPr>
+      <w:r>
+        <w:rPr>
+          <w:rFonts w:cs="Arial" w:ascii="Arial" w:hAnsi="Arial"/>
+          <w:position w:val="0"/>
+          <w:sz w:val="20"/>
+          <w:sz w:val="20"/>
+          <w:szCs w:val="20"/>
+          <w:vertAlign w:val="baseline"/>
+        </w:rPr>
+        <w:t>Uma descoberta para mim foi o fato que N8N é open-source, por isso ela pode ser executada via docker tão facilmente, o que permitiria automações em servidores fechados via N8N e ferramentas via a network, garantindo a segurança e consistência dos serviços.</w:t>
+      </w:r>
+    </w:p>
+    <w:p>
+      <w:pPr>
+        <w:pStyle w:val="Normal"/>
+        <w:rPr>
+          <w:rFonts w:ascii="Arial" w:hAnsi="Arial" w:cs="Arial"/>
+          <w:sz w:val="20"/>
+          <w:szCs w:val="20"/>
+        </w:rPr>
+      </w:pPr>
+      <w:r>
+        <w:rPr>
+          <w:rFonts w:cs="Arial" w:ascii="Arial" w:hAnsi="Arial"/>
+          <w:sz w:val="20"/>
+          <w:szCs w:val="20"/>
         </w:rPr>
       </w:r>
     </w:p>
@@ -171,20 +297,12 @@
     </w:p>
     <w:p>
       <w:pPr>
-        <w:pStyle w:val="Normal"/>
-        <w:rPr>
-          <w:rFonts w:ascii="Arial" w:hAnsi="Arial" w:cs="Arial"/>
-          <w:sz w:val="20"/>
-          <w:szCs w:val="20"/>
-        </w:rPr>
-      </w:pPr>
-      <w:r>
-        <w:rPr>
-          <w:rFonts w:cs="Arial" w:ascii="Arial" w:hAnsi="Arial"/>
-          <w:sz w:val="20"/>
-          <w:szCs w:val="20"/>
-        </w:rPr>
-        <w:t>&lt;Nesta seção o participante deverá descrever as suas conclusões sobre os temas abordados nas tarefas do card.&gt;</w:t>
+        <w:pStyle w:val="fa"/>
+        <w:rPr/>
+      </w:pPr>
+      <w:r>
+        <w:rPr/>
+        <w:t>A combinação de Docker e N8N permite o desenvolvimento de diversas automações, o Docker garante que o ambiente usado é consistente entre quaisquer máquinas e o N8N permite que serviços sejam automatizados, com ou sem modelos de IA, de maneira fácil e rápida. O uso de docker-compose com network em particular seria muito poderoso para desenvolvimento com agentes, visto que, mesmo ignorando as ferramentas já integradas com o N8N, ferramentas podem ser integradas facilmente e de maneira segura.</w:t>
       </w:r>
     </w:p>
     <w:p>
@@ -238,7 +356,144 @@
           <w:sz w:val="20"/>
           <w:szCs w:val="20"/>
         </w:rPr>
-        <w:t>&lt; Nesta seção deveram ser descritas as referências utilizadas para o desenvolvimento do relatório. Caso tenham sido utilizadas outras referências além das do card, também deveram estar descritas.&gt;</w:t>
+        <w:t>Do card:</w:t>
+      </w:r>
+    </w:p>
+    <w:p>
+      <w:pPr>
+        <w:pStyle w:val="fa"/>
+        <w:numPr>
+          <w:ilvl w:val="0"/>
+          <w:numId w:val="2"/>
+        </w:numPr>
+        <w:rPr/>
+      </w:pPr>
+      <w:r>
+        <w:rPr>
+          <w:rStyle w:val="Hyperlink"/>
+        </w:rPr>
+        <w:t>https://www.youtube.com/watch?v=CAedO3UaiU8</w:t>
+      </w:r>
+    </w:p>
+    <w:p>
+      <w:pPr>
+        <w:pStyle w:val="fa"/>
+        <w:numPr>
+          <w:ilvl w:val="0"/>
+          <w:numId w:val="2"/>
+        </w:numPr>
+        <w:rPr/>
+      </w:pPr>
+      <w:r>
+        <w:rPr>
+          <w:rStyle w:val="Hyperlink"/>
+        </w:rPr>
+        <w:t>https://docs.n8n.io/try-it-out/quickstart/</w:t>
+      </w:r>
+    </w:p>
+    <w:p>
+      <w:pPr>
+        <w:pStyle w:val="fa"/>
+        <w:numPr>
+          <w:ilvl w:val="0"/>
+          <w:numId w:val="2"/>
+        </w:numPr>
+        <w:rPr/>
+      </w:pPr>
+      <w:r>
+        <w:rPr>
+          <w:rStyle w:val="Hyperlink"/>
+        </w:rPr>
+        <w:t>https://docs.n8n.io/try-it-out/tutorial-first-workflow/</w:t>
+      </w:r>
+    </w:p>
+    <w:p>
+      <w:pPr>
+        <w:pStyle w:val="fa"/>
+        <w:numPr>
+          <w:ilvl w:val="0"/>
+          <w:numId w:val="2"/>
+        </w:numPr>
+        <w:rPr/>
+      </w:pPr>
+      <w:r>
+        <w:fldChar w:fldCharType="begin"/>
+      </w:r>
+      <w:r>
+        <w:rPr>
+          <w:rStyle w:val="Hyperlink"/>
+        </w:rPr>
+        <w:instrText xml:space="preserve"> HYPERLINK "https://docs.n8n.io/hosting/installation/docker/" \l "starting-n8n"</w:instrText>
+      </w:r>
+      <w:r>
+        <w:rPr>
+          <w:rStyle w:val="Hyperlink"/>
+        </w:rPr>
+        <w:fldChar w:fldCharType="separate"/>
+      </w:r>
+      <w:r>
+        <w:rPr>
+          <w:rStyle w:val="Hyperlink"/>
+        </w:rPr>
+        <w:t>https://docs.n8n.io/hosting/installation/docker/#starting-n8n</w:t>
+      </w:r>
+      <w:r>
+        <w:rPr>
+          <w:rStyle w:val="Hyperlink"/>
+        </w:rPr>
+        <w:fldChar w:fldCharType="end"/>
+      </w:r>
+    </w:p>
+    <w:p>
+      <w:pPr>
+        <w:pStyle w:val="Normal"/>
+        <w:spacing w:before="0" w:after="160"/>
+        <w:rPr>
+          <w:rFonts w:ascii="Arial" w:hAnsi="Arial" w:cs="Arial"/>
+          <w:sz w:val="20"/>
+          <w:szCs w:val="20"/>
+        </w:rPr>
+      </w:pPr>
+      <w:r>
+        <w:rPr>
+          <w:rFonts w:cs="Arial" w:ascii="Arial" w:hAnsi="Arial"/>
+          <w:sz w:val="20"/>
+          <w:szCs w:val="20"/>
+        </w:rPr>
+        <w:t>Externas:</w:t>
+      </w:r>
+    </w:p>
+    <w:p>
+      <w:pPr>
+        <w:pStyle w:val="fa"/>
+        <w:numPr>
+          <w:ilvl w:val="0"/>
+          <w:numId w:val="1"/>
+        </w:numPr>
+        <w:rPr/>
+      </w:pPr>
+      <w:r>
+        <w:rPr>
+          <w:rStyle w:val="Hyperlink"/>
+        </w:rPr>
+        <w:t>https://docs.docker.com/compose/how-tos/networking/</w:t>
+      </w:r>
+    </w:p>
+    <w:p>
+      <w:pPr>
+        <w:pStyle w:val="fa"/>
+        <w:numPr>
+          <w:ilvl w:val="0"/>
+          <w:numId w:val="1"/>
+        </w:numPr>
+        <w:spacing w:before="0" w:after="160"/>
+        <w:rPr/>
+      </w:pPr>
+      <w:r>
+        <w:rPr>
+          <w:rStyle w:val="Hyperlink"/>
+        </w:rPr>
+        <w:t>https://github.com/n8n-io/n8n</w:t>
       </w:r>
     </w:p>
     <w:sectPr>
@@ -252,6 +507,413 @@
     </w:sectPr>
   </w:body>
 </w:document>
+</file>
+
+<file path=word/numbering.xml><?xml version="1.0" encoding="utf-8"?>
+<w:numbering xmlns:w="http://schemas.openxmlformats.org/wordprocessingml/2006/main" xmlns:o="urn:schemas-microsoft-com:office:office" xmlns:r="http://schemas.openxmlformats.org/officeDocument/2006/relationships" xmlns:v="urn:schemas-microsoft-com:vml" xmlns:mc="http://schemas.openxmlformats.org/markup-compatibility/2006" xmlns:w14="http://schemas.microsoft.com/office/word/2010/wordml" mc:Ignorable="w14">
+  <w:abstractNum w:abstractNumId="1">
+    <w:lvl w:ilvl="0">
+      <w:start w:val="1"/>
+      <w:numFmt w:val="bullet"/>
+      <w:lvlText w:val=""/>
+      <w:lvlJc w:val="left"/>
+      <w:pPr>
+        <w:tabs>
+          <w:tab w:val="num" w:pos="720"/>
+        </w:tabs>
+        <w:ind w:left="720" w:hanging="360"/>
+      </w:pPr>
+      <w:rPr>
+        <w:rFonts w:ascii="Symbol" w:hAnsi="Symbol" w:cs="Symbol" w:hint="default"/>
+      </w:rPr>
+    </w:lvl>
+    <w:lvl w:ilvl="1">
+      <w:start w:val="1"/>
+      <w:numFmt w:val="bullet"/>
+      <w:lvlText w:val="◦"/>
+      <w:lvlJc w:val="left"/>
+      <w:pPr>
+        <w:tabs>
+          <w:tab w:val="num" w:pos="1080"/>
+        </w:tabs>
+        <w:ind w:left="1080" w:hanging="360"/>
+      </w:pPr>
+      <w:rPr>
+        <w:rFonts w:ascii="OpenSymbol" w:hAnsi="OpenSymbol" w:cs="OpenSymbol" w:hint="default"/>
+      </w:rPr>
+    </w:lvl>
+    <w:lvl w:ilvl="2">
+      <w:start w:val="1"/>
+      <w:numFmt w:val="bullet"/>
+      <w:lvlText w:val="▪"/>
+      <w:lvlJc w:val="left"/>
+      <w:pPr>
+        <w:tabs>
+          <w:tab w:val="num" w:pos="1440"/>
+        </w:tabs>
+        <w:ind w:left="1440" w:hanging="360"/>
+      </w:pPr>
+      <w:rPr>
+        <w:rFonts w:ascii="OpenSymbol" w:hAnsi="OpenSymbol" w:cs="OpenSymbol" w:hint="default"/>
+      </w:rPr>
+    </w:lvl>
+    <w:lvl w:ilvl="3">
+      <w:start w:val="1"/>
+      <w:numFmt w:val="bullet"/>
+      <w:lvlText w:val=""/>
+      <w:lvlJc w:val="left"/>
+      <w:pPr>
+        <w:tabs>
+          <w:tab w:val="num" w:pos="1800"/>
+        </w:tabs>
+        <w:ind w:left="1800" w:hanging="360"/>
+      </w:pPr>
+      <w:rPr>
+        <w:rFonts w:ascii="Symbol" w:hAnsi="Symbol" w:cs="Symbol" w:hint="default"/>
+      </w:rPr>
+    </w:lvl>
+    <w:lvl w:ilvl="4">
+      <w:start w:val="1"/>
+      <w:numFmt w:val="bullet"/>
+      <w:lvlText w:val="◦"/>
+      <w:lvlJc w:val="left"/>
+      <w:pPr>
+        <w:tabs>
+          <w:tab w:val="num" w:pos="2160"/>
+        </w:tabs>
+        <w:ind w:left="2160" w:hanging="360"/>
+      </w:pPr>
+      <w:rPr>
+        <w:rFonts w:ascii="OpenSymbol" w:hAnsi="OpenSymbol" w:cs="OpenSymbol" w:hint="default"/>
+      </w:rPr>
+    </w:lvl>
+    <w:lvl w:ilvl="5">
+      <w:start w:val="1"/>
+      <w:numFmt w:val="bullet"/>
+      <w:lvlText w:val="▪"/>
+      <w:lvlJc w:val="left"/>
+      <w:pPr>
+        <w:tabs>
+          <w:tab w:val="num" w:pos="2520"/>
+        </w:tabs>
+        <w:ind w:left="2520" w:hanging="360"/>
+      </w:pPr>
+      <w:rPr>
+        <w:rFonts w:ascii="OpenSymbol" w:hAnsi="OpenSymbol" w:cs="OpenSymbol" w:hint="default"/>
+      </w:rPr>
+    </w:lvl>
+    <w:lvl w:ilvl="6">
+      <w:start w:val="1"/>
+      <w:numFmt w:val="bullet"/>
+      <w:lvlText w:val=""/>
+      <w:lvlJc w:val="left"/>
+      <w:pPr>
+        <w:tabs>
+          <w:tab w:val="num" w:pos="2880"/>
+        </w:tabs>
+        <w:ind w:left="2880" w:hanging="360"/>
+      </w:pPr>
+      <w:rPr>
+        <w:rFonts w:ascii="Symbol" w:hAnsi="Symbol" w:cs="Symbol" w:hint="default"/>
+      </w:rPr>
+    </w:lvl>
+    <w:lvl w:ilvl="7">
+      <w:start w:val="1"/>
+      <w:numFmt w:val="bullet"/>
+      <w:lvlText w:val="◦"/>
+      <w:lvlJc w:val="left"/>
+      <w:pPr>
+        <w:tabs>
+          <w:tab w:val="num" w:pos="3240"/>
+        </w:tabs>
+        <w:ind w:left="3240" w:hanging="360"/>
+      </w:pPr>
+      <w:rPr>
+        <w:rFonts w:ascii="OpenSymbol" w:hAnsi="OpenSymbol" w:cs="OpenSymbol" w:hint="default"/>
+      </w:rPr>
+    </w:lvl>
+    <w:lvl w:ilvl="8">
+      <w:start w:val="1"/>
+      <w:numFmt w:val="bullet"/>
+      <w:lvlText w:val="▪"/>
+      <w:lvlJc w:val="left"/>
+      <w:pPr>
+        <w:tabs>
+          <w:tab w:val="num" w:pos="3600"/>
+        </w:tabs>
+        <w:ind w:left="3600" w:hanging="360"/>
+      </w:pPr>
+      <w:rPr>
+        <w:rFonts w:ascii="OpenSymbol" w:hAnsi="OpenSymbol" w:cs="OpenSymbol" w:hint="default"/>
+      </w:rPr>
+    </w:lvl>
+  </w:abstractNum>
+  <w:abstractNum w:abstractNumId="2">
+    <w:lvl w:ilvl="0">
+      <w:start w:val="1"/>
+      <w:numFmt w:val="bullet"/>
+      <w:lvlText w:val=""/>
+      <w:lvlJc w:val="left"/>
+      <w:pPr>
+        <w:tabs>
+          <w:tab w:val="num" w:pos="720"/>
+        </w:tabs>
+        <w:ind w:left="720" w:hanging="360"/>
+      </w:pPr>
+      <w:rPr>
+        <w:rFonts w:ascii="Symbol" w:hAnsi="Symbol" w:cs="Symbol" w:hint="default"/>
+      </w:rPr>
+    </w:lvl>
+    <w:lvl w:ilvl="1">
+      <w:start w:val="1"/>
+      <w:numFmt w:val="bullet"/>
+      <w:lvlText w:val="◦"/>
+      <w:lvlJc w:val="left"/>
+      <w:pPr>
+        <w:tabs>
+          <w:tab w:val="num" w:pos="1080"/>
+        </w:tabs>
+        <w:ind w:left="1080" w:hanging="360"/>
+      </w:pPr>
+      <w:rPr>
+        <w:rFonts w:ascii="OpenSymbol" w:hAnsi="OpenSymbol" w:cs="OpenSymbol" w:hint="default"/>
+      </w:rPr>
+    </w:lvl>
+    <w:lvl w:ilvl="2">
+      <w:start w:val="1"/>
+      <w:numFmt w:val="bullet"/>
+      <w:lvlText w:val="▪"/>
+      <w:lvlJc w:val="left"/>
+      <w:pPr>
+        <w:tabs>
+          <w:tab w:val="num" w:pos="1440"/>
+        </w:tabs>
+        <w:ind w:left="1440" w:hanging="360"/>
+      </w:pPr>
+      <w:rPr>
+        <w:rFonts w:ascii="OpenSymbol" w:hAnsi="OpenSymbol" w:cs="OpenSymbol" w:hint="default"/>
+      </w:rPr>
+    </w:lvl>
+    <w:lvl w:ilvl="3">
+      <w:start w:val="1"/>
+      <w:numFmt w:val="bullet"/>
+      <w:lvlText w:val=""/>
+      <w:lvlJc w:val="left"/>
+      <w:pPr>
+        <w:tabs>
+          <w:tab w:val="num" w:pos="1800"/>
+        </w:tabs>
+        <w:ind w:left="1800" w:hanging="360"/>
+      </w:pPr>
+      <w:rPr>
+        <w:rFonts w:ascii="Symbol" w:hAnsi="Symbol" w:cs="Symbol" w:hint="default"/>
+      </w:rPr>
+    </w:lvl>
+    <w:lvl w:ilvl="4">
+      <w:start w:val="1"/>
+      <w:numFmt w:val="bullet"/>
+      <w:lvlText w:val="◦"/>
+      <w:lvlJc w:val="left"/>
+      <w:pPr>
+        <w:tabs>
+          <w:tab w:val="num" w:pos="2160"/>
+        </w:tabs>
+        <w:ind w:left="2160" w:hanging="360"/>
+      </w:pPr>
+      <w:rPr>
+        <w:rFonts w:ascii="OpenSymbol" w:hAnsi="OpenSymbol" w:cs="OpenSymbol" w:hint="default"/>
+      </w:rPr>
+    </w:lvl>
+    <w:lvl w:ilvl="5">
+      <w:start w:val="1"/>
+      <w:numFmt w:val="bullet"/>
+      <w:lvlText w:val="▪"/>
+      <w:lvlJc w:val="left"/>
+      <w:pPr>
+        <w:tabs>
+          <w:tab w:val="num" w:pos="2520"/>
+        </w:tabs>
+        <w:ind w:left="2520" w:hanging="360"/>
+      </w:pPr>
+      <w:rPr>
+        <w:rFonts w:ascii="OpenSymbol" w:hAnsi="OpenSymbol" w:cs="OpenSymbol" w:hint="default"/>
+      </w:rPr>
+    </w:lvl>
+    <w:lvl w:ilvl="6">
+      <w:start w:val="1"/>
+      <w:numFmt w:val="bullet"/>
+      <w:lvlText w:val=""/>
+      <w:lvlJc w:val="left"/>
+      <w:pPr>
+        <w:tabs>
+          <w:tab w:val="num" w:pos="2880"/>
+        </w:tabs>
+        <w:ind w:left="2880" w:hanging="360"/>
+      </w:pPr>
+      <w:rPr>
+        <w:rFonts w:ascii="Symbol" w:hAnsi="Symbol" w:cs="Symbol" w:hint="default"/>
+      </w:rPr>
+    </w:lvl>
+    <w:lvl w:ilvl="7">
+      <w:start w:val="1"/>
+      <w:numFmt w:val="bullet"/>
+      <w:lvlText w:val="◦"/>
+      <w:lvlJc w:val="left"/>
+      <w:pPr>
+        <w:tabs>
+          <w:tab w:val="num" w:pos="3240"/>
+        </w:tabs>
+        <w:ind w:left="3240" w:hanging="360"/>
+      </w:pPr>
+      <w:rPr>
+        <w:rFonts w:ascii="OpenSymbol" w:hAnsi="OpenSymbol" w:cs="OpenSymbol" w:hint="default"/>
+      </w:rPr>
+    </w:lvl>
+    <w:lvl w:ilvl="8">
+      <w:start w:val="1"/>
+      <w:numFmt w:val="bullet"/>
+      <w:lvlText w:val="▪"/>
+      <w:lvlJc w:val="left"/>
+      <w:pPr>
+        <w:tabs>
+          <w:tab w:val="num" w:pos="3600"/>
+        </w:tabs>
+        <w:ind w:left="3600" w:hanging="360"/>
+      </w:pPr>
+      <w:rPr>
+        <w:rFonts w:ascii="OpenSymbol" w:hAnsi="OpenSymbol" w:cs="OpenSymbol" w:hint="default"/>
+      </w:rPr>
+    </w:lvl>
+  </w:abstractNum>
+  <w:abstractNum w:abstractNumId="3">
+    <w:lvl w:ilvl="0">
+      <w:start w:val="1"/>
+      <w:numFmt w:val="none"/>
+      <w:suff w:val="nothing"/>
+      <w:lvlText w:val=""/>
+      <w:lvlJc w:val="left"/>
+      <w:pPr>
+        <w:tabs>
+          <w:tab w:val="num" w:pos="0"/>
+        </w:tabs>
+        <w:ind w:left="0" w:hanging="0"/>
+      </w:pPr>
+    </w:lvl>
+    <w:lvl w:ilvl="1">
+      <w:start w:val="1"/>
+      <w:numFmt w:val="none"/>
+      <w:suff w:val="nothing"/>
+      <w:lvlText w:val=""/>
+      <w:lvlJc w:val="left"/>
+      <w:pPr>
+        <w:tabs>
+          <w:tab w:val="num" w:pos="0"/>
+        </w:tabs>
+        <w:ind w:left="0" w:hanging="0"/>
+      </w:pPr>
+    </w:lvl>
+    <w:lvl w:ilvl="2">
+      <w:start w:val="1"/>
+      <w:numFmt w:val="none"/>
+      <w:suff w:val="nothing"/>
+      <w:lvlText w:val=""/>
+      <w:lvlJc w:val="left"/>
+      <w:pPr>
+        <w:tabs>
+          <w:tab w:val="num" w:pos="0"/>
+        </w:tabs>
+        <w:ind w:left="0" w:hanging="0"/>
+      </w:pPr>
+    </w:lvl>
+    <w:lvl w:ilvl="3">
+      <w:start w:val="1"/>
+      <w:numFmt w:val="none"/>
+      <w:suff w:val="nothing"/>
+      <w:lvlText w:val=""/>
+      <w:lvlJc w:val="left"/>
+      <w:pPr>
+        <w:tabs>
+          <w:tab w:val="num" w:pos="0"/>
+        </w:tabs>
+        <w:ind w:left="0" w:hanging="0"/>
+      </w:pPr>
+    </w:lvl>
+    <w:lvl w:ilvl="4">
+      <w:start w:val="1"/>
+      <w:numFmt w:val="none"/>
+      <w:suff w:val="nothing"/>
+      <w:lvlText w:val=""/>
+      <w:lvlJc w:val="left"/>
+      <w:pPr>
+        <w:tabs>
+          <w:tab w:val="num" w:pos="0"/>
+        </w:tabs>
+        <w:ind w:left="0" w:hanging="0"/>
+      </w:pPr>
+    </w:lvl>
+    <w:lvl w:ilvl="5">
+      <w:start w:val="1"/>
+      <w:numFmt w:val="none"/>
+      <w:suff w:val="nothing"/>
+      <w:lvlText w:val=""/>
+      <w:lvlJc w:val="left"/>
+      <w:pPr>
+        <w:tabs>
+          <w:tab w:val="num" w:pos="0"/>
+        </w:tabs>
+        <w:ind w:left="0" w:hanging="0"/>
+      </w:pPr>
+    </w:lvl>
+    <w:lvl w:ilvl="6">
+      <w:start w:val="1"/>
+      <w:numFmt w:val="none"/>
+      <w:suff w:val="nothing"/>
+      <w:lvlText w:val=""/>
+      <w:lvlJc w:val="left"/>
+      <w:pPr>
+        <w:tabs>
+          <w:tab w:val="num" w:pos="0"/>
+        </w:tabs>
+        <w:ind w:left="0" w:hanging="0"/>
+      </w:pPr>
+    </w:lvl>
+    <w:lvl w:ilvl="7">
+      <w:start w:val="1"/>
+      <w:numFmt w:val="none"/>
+      <w:suff w:val="nothing"/>
+      <w:lvlText w:val=""/>
+      <w:lvlJc w:val="left"/>
+      <w:pPr>
+        <w:tabs>
+          <w:tab w:val="num" w:pos="0"/>
+        </w:tabs>
+        <w:ind w:left="0" w:hanging="0"/>
+      </w:pPr>
+    </w:lvl>
+    <w:lvl w:ilvl="8">
+      <w:start w:val="1"/>
+      <w:numFmt w:val="none"/>
+      <w:suff w:val="nothing"/>
+      <w:lvlText w:val=""/>
+      <w:lvlJc w:val="left"/>
+      <w:pPr>
+        <w:tabs>
+          <w:tab w:val="num" w:pos="0"/>
+        </w:tabs>
+        <w:ind w:left="0" w:hanging="0"/>
+      </w:pPr>
+    </w:lvl>
+  </w:abstractNum>
+  <w:num w:numId="1">
+    <w:abstractNumId w:val="1"/>
+  </w:num>
+  <w:num w:numId="2">
+    <w:abstractNumId w:val="2"/>
+  </w:num>
+  <w:num w:numId="3">
+    <w:abstractNumId w:val="3"/>
+  </w:num>
+</w:numbering>
 </file>
 
 <file path=word/styles.xml><?xml version="1.0" encoding="utf-8"?>
@@ -680,6 +1342,20 @@
     <w:qFormat/>
     <w:rPr/>
   </w:style>
+  <w:style w:type="character" w:styleId="Bullets">
+    <w:name w:val="Bullets"/>
+    <w:qFormat/>
+    <w:rPr>
+      <w:rFonts w:ascii="OpenSymbol" w:hAnsi="OpenSymbol" w:eastAsia="OpenSymbol" w:cs="OpenSymbol"/>
+    </w:rPr>
+  </w:style>
+  <w:style w:type="character" w:styleId="Hyperlink">
+    <w:name w:val="Hyperlink"/>
+    <w:rPr>
+      <w:color w:val="000080"/>
+      <w:u w:val="single"/>
+    </w:rPr>
+  </w:style>
   <w:style w:type="paragraph" w:styleId="Heading">
     <w:name w:val="Heading"/>
     <w:basedOn w:val="Normal"/>
@@ -736,6 +1412,16 @@
     </w:pPr>
     <w:rPr>
       <w:rFonts w:cs="Noto Sans Devanagari"/>
+    </w:rPr>
+  </w:style>
+  <w:style w:type="paragraph" w:styleId="fa">
+    <w:name w:val="fa"/>
+    <w:basedOn w:val="Normal"/>
+    <w:qFormat/>
+    <w:pPr/>
+    <w:rPr>
+      <w:rFonts w:ascii="arial" w:hAnsi="arial"/>
+      <w:sz w:val="20"/>
     </w:rPr>
   </w:style>
   <w:style w:type="numbering" w:styleId="NoList" w:default="1">

</xml_diff>

<commit_message>
docs: Update entrega 4 e inicio da entrega 5
</commit_message>
<xml_diff>
--- a/atv04/04-Leonardo_Cortes_Filho.docx
+++ b/atv04/04-Leonardo_Cortes_Filho.docx
@@ -192,6 +192,324 @@
         <w:pStyle w:val="Normal"/>
         <w:rPr>
           <w:rFonts w:ascii="Arial" w:hAnsi="Arial" w:cs="Arial"/>
+          <w:sz w:val="20"/>
+          <w:szCs w:val="20"/>
+        </w:rPr>
+      </w:pPr>
+      <w:r>
+        <w:rPr>
+          <w:rFonts w:cs="Arial" w:ascii="Arial" w:hAnsi="Arial"/>
+          <w:sz w:val="20"/>
+          <w:szCs w:val="20"/>
+        </w:rPr>
+        <w:t>Exemplo do quickstart com saída customizada:</w:t>
+      </w:r>
+    </w:p>
+    <w:p>
+      <w:pPr>
+        <w:pStyle w:val="Normal"/>
+        <w:rPr>
+          <w:rFonts w:ascii="Arial" w:hAnsi="Arial" w:cs="Arial"/>
+          <w:sz w:val="20"/>
+          <w:szCs w:val="20"/>
+        </w:rPr>
+      </w:pPr>
+      <w:r>
+        <w:rPr/>
+        <w:drawing>
+          <wp:anchor behindDoc="0" distT="0" distB="0" distL="0" distR="0" simplePos="0" locked="0" layoutInCell="0" allowOverlap="1" relativeHeight="6">
+            <wp:simplePos x="0" y="0"/>
+            <wp:positionH relativeFrom="column">
+              <wp:align>center</wp:align>
+            </wp:positionH>
+            <wp:positionV relativeFrom="paragraph">
+              <wp:posOffset>635</wp:posOffset>
+            </wp:positionV>
+            <wp:extent cx="5400040" cy="3456940"/>
+            <wp:effectExtent l="0" t="0" r="0" b="0"/>
+            <wp:wrapSquare wrapText="largest"/>
+            <wp:docPr id="2" name="Image5" descr=""/>
+            <wp:cNvGraphicFramePr>
+              <a:graphicFrameLocks xmlns:a="http://schemas.openxmlformats.org/drawingml/2006/main" noChangeAspect="1"/>
+            </wp:cNvGraphicFramePr>
+            <a:graphic xmlns:a="http://schemas.openxmlformats.org/drawingml/2006/main">
+              <a:graphicData uri="http://schemas.openxmlformats.org/drawingml/2006/picture">
+                <pic:pic xmlns:pic="http://schemas.openxmlformats.org/drawingml/2006/picture">
+                  <pic:nvPicPr>
+                    <pic:cNvPr id="2" name="Image5" descr=""/>
+                    <pic:cNvPicPr>
+                      <a:picLocks noChangeAspect="1" noChangeArrowheads="1"/>
+                    </pic:cNvPicPr>
+                  </pic:nvPicPr>
+                  <pic:blipFill>
+                    <a:blip r:embed="rId3"/>
+                    <a:stretch>
+                      <a:fillRect/>
+                    </a:stretch>
+                  </pic:blipFill>
+                  <pic:spPr bwMode="auto">
+                    <a:xfrm>
+                      <a:off x="0" y="0"/>
+                      <a:ext cx="5400040" cy="3456940"/>
+                    </a:xfrm>
+                    <a:prstGeom prst="rect">
+                      <a:avLst/>
+                    </a:prstGeom>
+                  </pic:spPr>
+                </pic:pic>
+              </a:graphicData>
+            </a:graphic>
+          </wp:anchor>
+        </w:drawing>
+      </w:r>
+    </w:p>
+    <w:p>
+      <w:pPr>
+        <w:pStyle w:val="Normal"/>
+        <w:rPr>
+          <w:rFonts w:ascii="Arial" w:hAnsi="Arial" w:cs="Arial"/>
+          <w:sz w:val="20"/>
+          <w:szCs w:val="20"/>
+        </w:rPr>
+      </w:pPr>
+      <w:r>
+        <w:rPr>
+          <w:rFonts w:cs="Arial" w:ascii="Arial" w:hAnsi="Arial"/>
+          <w:sz w:val="20"/>
+          <w:szCs w:val="20"/>
+        </w:rPr>
+        <w:t>Exemplo de uma workflow:</w:t>
+      </w:r>
+    </w:p>
+    <w:p>
+      <w:pPr>
+        <w:pStyle w:val="Normal"/>
+        <w:rPr>
+          <w:rFonts w:ascii="Arial" w:hAnsi="Arial" w:cs="Arial"/>
+          <w:sz w:val="20"/>
+          <w:szCs w:val="20"/>
+        </w:rPr>
+      </w:pPr>
+      <w:r>
+        <w:rPr>
+          <w:rFonts w:cs="Arial" w:ascii="Arial" w:hAnsi="Arial"/>
+          <w:sz w:val="20"/>
+          <w:szCs w:val="20"/>
+        </w:rPr>
+        <w:t>Recebe um e-mail (com header específico) e responde de acordo com os dados de um PDF pré-definido.</w:t>
+      </w:r>
+    </w:p>
+    <w:p>
+      <w:pPr>
+        <w:pStyle w:val="Normal"/>
+        <w:rPr>
+          <w:rFonts w:ascii="Arial" w:hAnsi="Arial" w:cs="Arial"/>
+          <w:sz w:val="20"/>
+          <w:szCs w:val="20"/>
+        </w:rPr>
+      </w:pPr>
+      <w:r>
+        <w:drawing>
+          <wp:anchor behindDoc="0" distT="0" distB="0" distL="0" distR="0" simplePos="0" locked="0" layoutInCell="0" allowOverlap="1" relativeHeight="3">
+            <wp:simplePos x="0" y="0"/>
+            <wp:positionH relativeFrom="column">
+              <wp:align>center</wp:align>
+            </wp:positionH>
+            <wp:positionV relativeFrom="paragraph">
+              <wp:posOffset>635</wp:posOffset>
+            </wp:positionV>
+            <wp:extent cx="5400040" cy="1155700"/>
+            <wp:effectExtent l="0" t="0" r="0" b="0"/>
+            <wp:wrapTopAndBottom/>
+            <wp:docPr id="3" name="Image2" descr=""/>
+            <wp:cNvGraphicFramePr>
+              <a:graphicFrameLocks xmlns:a="http://schemas.openxmlformats.org/drawingml/2006/main" noChangeAspect="1"/>
+            </wp:cNvGraphicFramePr>
+            <a:graphic xmlns:a="http://schemas.openxmlformats.org/drawingml/2006/main">
+              <a:graphicData uri="http://schemas.openxmlformats.org/drawingml/2006/picture">
+                <pic:pic xmlns:pic="http://schemas.openxmlformats.org/drawingml/2006/picture">
+                  <pic:nvPicPr>
+                    <pic:cNvPr id="3" name="Image2" descr=""/>
+                    <pic:cNvPicPr>
+                      <a:picLocks noChangeAspect="1" noChangeArrowheads="1"/>
+                    </pic:cNvPicPr>
+                  </pic:nvPicPr>
+                  <pic:blipFill>
+                    <a:blip r:embed="rId4"/>
+                    <a:stretch>
+                      <a:fillRect/>
+                    </a:stretch>
+                  </pic:blipFill>
+                  <pic:spPr bwMode="auto">
+                    <a:xfrm>
+                      <a:off x="0" y="0"/>
+                      <a:ext cx="5400040" cy="1155700"/>
+                    </a:xfrm>
+                    <a:prstGeom prst="rect">
+                      <a:avLst/>
+                    </a:prstGeom>
+                  </pic:spPr>
+                </pic:pic>
+              </a:graphicData>
+            </a:graphic>
+          </wp:anchor>
+        </w:drawing>
+      </w:r>
+      <w:r>
+        <w:rPr>
+          <w:rFonts w:cs="Arial" w:ascii="Arial" w:hAnsi="Arial"/>
+          <w:sz w:val="20"/>
+          <w:szCs w:val="20"/>
+        </w:rPr>
+        <w:t>Automação mencionada no parágrafo anterior:</w:t>
+      </w:r>
+    </w:p>
+    <w:p>
+      <w:pPr>
+        <w:pStyle w:val="Normal"/>
+        <w:rPr>
+          <w:rFonts w:ascii="Arial" w:hAnsi="Arial" w:cs="Arial"/>
+          <w:sz w:val="20"/>
+          <w:szCs w:val="20"/>
+        </w:rPr>
+      </w:pPr>
+      <w:r>
+        <w:rPr>
+          <w:rFonts w:cs="Arial" w:ascii="Arial" w:hAnsi="Arial"/>
+          <w:sz w:val="20"/>
+          <w:szCs w:val="20"/>
+        </w:rPr>
+        <w:t>Olha todos os e-mails da última semana, se não for da SECOM é incluído no resumo dos e-mails semanais.</w:t>
+      </w:r>
+    </w:p>
+    <w:p>
+      <w:pPr>
+        <w:pStyle w:val="Normal"/>
+        <w:rPr>
+          <w:rFonts w:ascii="Arial" w:hAnsi="Arial" w:cs="Arial"/>
+          <w:sz w:val="20"/>
+          <w:szCs w:val="20"/>
+        </w:rPr>
+      </w:pPr>
+      <w:r>
+        <w:drawing>
+          <wp:anchor behindDoc="0" distT="0" distB="0" distL="0" distR="0" simplePos="0" locked="0" layoutInCell="0" allowOverlap="1" relativeHeight="4">
+            <wp:simplePos x="0" y="0"/>
+            <wp:positionH relativeFrom="column">
+              <wp:align>center</wp:align>
+            </wp:positionH>
+            <wp:positionV relativeFrom="paragraph">
+              <wp:posOffset>635</wp:posOffset>
+            </wp:positionV>
+            <wp:extent cx="5400040" cy="1474470"/>
+            <wp:effectExtent l="0" t="0" r="0" b="0"/>
+            <wp:wrapTopAndBottom/>
+            <wp:docPr id="4" name="Image3" descr=""/>
+            <wp:cNvGraphicFramePr>
+              <a:graphicFrameLocks xmlns:a="http://schemas.openxmlformats.org/drawingml/2006/main" noChangeAspect="1"/>
+            </wp:cNvGraphicFramePr>
+            <a:graphic xmlns:a="http://schemas.openxmlformats.org/drawingml/2006/main">
+              <a:graphicData uri="http://schemas.openxmlformats.org/drawingml/2006/picture">
+                <pic:pic xmlns:pic="http://schemas.openxmlformats.org/drawingml/2006/picture">
+                  <pic:nvPicPr>
+                    <pic:cNvPr id="4" name="Image3" descr=""/>
+                    <pic:cNvPicPr>
+                      <a:picLocks noChangeAspect="1" noChangeArrowheads="1"/>
+                    </pic:cNvPicPr>
+                  </pic:nvPicPr>
+                  <pic:blipFill>
+                    <a:blip r:embed="rId5"/>
+                    <a:stretch>
+                      <a:fillRect/>
+                    </a:stretch>
+                  </pic:blipFill>
+                  <pic:spPr bwMode="auto">
+                    <a:xfrm>
+                      <a:off x="0" y="0"/>
+                      <a:ext cx="5400040" cy="1474470"/>
+                    </a:xfrm>
+                    <a:prstGeom prst="rect">
+                      <a:avLst/>
+                    </a:prstGeom>
+                  </pic:spPr>
+                </pic:pic>
+              </a:graphicData>
+            </a:graphic>
+          </wp:anchor>
+        </w:drawing>
+      </w:r>
+      <w:r>
+        <w:rPr>
+          <w:rFonts w:cs="Arial" w:ascii="Arial" w:hAnsi="Arial"/>
+          <w:sz w:val="20"/>
+          <w:szCs w:val="20"/>
+        </w:rPr>
+        <w:t>Output exemplo:</w:t>
+      </w:r>
+    </w:p>
+    <w:p>
+      <w:pPr>
+        <w:pStyle w:val="Normal"/>
+        <w:rPr>
+          <w:rFonts w:ascii="Arial" w:hAnsi="Arial" w:cs="Arial"/>
+          <w:sz w:val="20"/>
+          <w:szCs w:val="20"/>
+        </w:rPr>
+      </w:pPr>
+      <w:r>
+        <w:rPr/>
+        <w:drawing>
+          <wp:anchor behindDoc="0" distT="0" distB="0" distL="0" distR="0" simplePos="0" locked="0" layoutInCell="0" allowOverlap="1" relativeHeight="5">
+            <wp:simplePos x="0" y="0"/>
+            <wp:positionH relativeFrom="column">
+              <wp:align>center</wp:align>
+            </wp:positionH>
+            <wp:positionV relativeFrom="paragraph">
+              <wp:posOffset>635</wp:posOffset>
+            </wp:positionV>
+            <wp:extent cx="5400040" cy="2967355"/>
+            <wp:effectExtent l="0" t="0" r="0" b="0"/>
+            <wp:wrapTopAndBottom/>
+            <wp:docPr id="5" name="Image4" descr=""/>
+            <wp:cNvGraphicFramePr>
+              <a:graphicFrameLocks xmlns:a="http://schemas.openxmlformats.org/drawingml/2006/main" noChangeAspect="1"/>
+            </wp:cNvGraphicFramePr>
+            <a:graphic xmlns:a="http://schemas.openxmlformats.org/drawingml/2006/main">
+              <a:graphicData uri="http://schemas.openxmlformats.org/drawingml/2006/picture">
+                <pic:pic xmlns:pic="http://schemas.openxmlformats.org/drawingml/2006/picture">
+                  <pic:nvPicPr>
+                    <pic:cNvPr id="5" name="Image4" descr=""/>
+                    <pic:cNvPicPr>
+                      <a:picLocks noChangeAspect="1" noChangeArrowheads="1"/>
+                    </pic:cNvPicPr>
+                  </pic:nvPicPr>
+                  <pic:blipFill>
+                    <a:blip r:embed="rId6"/>
+                    <a:stretch>
+                      <a:fillRect/>
+                    </a:stretch>
+                  </pic:blipFill>
+                  <pic:spPr bwMode="auto">
+                    <a:xfrm>
+                      <a:off x="0" y="0"/>
+                      <a:ext cx="5400040" cy="2967355"/>
+                    </a:xfrm>
+                    <a:prstGeom prst="rect">
+                      <a:avLst/>
+                    </a:prstGeom>
+                  </pic:spPr>
+                </pic:pic>
+              </a:graphicData>
+            </a:graphic>
+          </wp:anchor>
+        </w:drawing>
+      </w:r>
+    </w:p>
+    <w:p>
+      <w:pPr>
+        <w:pStyle w:val="Normal"/>
+        <w:rPr>
+          <w:rFonts w:ascii="Arial" w:hAnsi="Arial" w:cs="Arial"/>
           <w:position w:val="0"/>
           <w:sz w:val="20"/>
           <w:sz w:val="20"/>
@@ -261,14 +579,16 @@
           <w:sz w:val="20"/>
           <w:szCs w:val="20"/>
         </w:rPr>
-        <w:t>&lt;Nesta seção o participante deverá descrever as dificuldades encontradas na tarefa e como fez para superá-las.&gt;</w:t>
-      </w:r>
-    </w:p>
-    <w:p>
-      <w:pPr>
-        <w:pStyle w:val="Normal"/>
-        <w:rPr>
-          <w:rFonts w:ascii="Arial" w:hAnsi="Arial" w:cs="Arial"/>
+        <w:t>Nenhuma dificuldade específica.</w:t>
+      </w:r>
+    </w:p>
+    <w:p>
+      <w:pPr>
+        <w:pStyle w:val="Normal"/>
+        <w:rPr>
+          <w:rFonts w:ascii="Arial" w:hAnsi="Arial" w:cs="Arial"/>
+          <w:sz w:val="20"/>
+          <w:szCs w:val="20"/>
         </w:rPr>
       </w:pPr>
       <w:r>

</xml_diff>